<commit_message>
docs: fold attachments UI, frontend tests, code-splitting and a11y into the report
Updates the generated system report so this round's frontend work reads
as native functionality, not a changelog entry:

- File attachments: the "no browser screen" caveat is gone from the
  known-limitations list, Table 9, and the module description — replaced
  with the accurate current state (live on the four document detail
  pages; other record types still API-only). The roadmap item is
  narrowed to match what's actually left.
- Testing (section 14): documents the new 37-test Vitest/RTL suite
  alongside the existing 97 backend tests, and that CI now runs both.
- Architecture (Table 8): notes route-level code-splitting and the
  frontend test stack.
- Security/testing prose: notes oxlint's jsx-a11y plugin and what it
  checks (label association, keyboard reachability, focus discipline).

Regenerated via `python docs/build_report.py`.

Co-Authored-By: Claude Sonnet 5 <noreply@anthropic.com>
</commit_message>
<xml_diff>
--- a/docs/Nautilus-ERP-System-Report.docx
+++ b/docs/Nautilus-ERP-System-Report.docx
@@ -804,7 +804,7 @@
         <w:rPr>
           <w:i w:val="0"/>
         </w:rPr>
-        <w:t>A seventh capability sits underneath these six rather than beside them: any record in any module can carry file attachments — a scanned supplier invoice, a delivery photo, a signed contract — uploaded, listed, downloaded and removed through the API by referencing the record they belong to. This is implemented end to end on the server and is honestly a backend capability today: no screen in the browser client yet uploads or displays a file. Section 11 documents the endpoints.</w:t>
+        <w:t>A seventh capability sits underneath these six rather than beside them: any record in any module can carry file attachments — a scanned supplier invoice, a delivery photo, a signed contract — uploaded, listed, downloaded and removed by referencing the record they belong to, without a schema change per module. The screen is live today on the four document detail pages — sales orders, customer invoices, purchase orders, supplier invoices — as an Attachments card alongside each document's lines; other record types (products, customers, suppliers) can use the same API but do not yet have the screen wired in. Section 11 documents the endpoints.</w:t>
       </w:r>
     </w:p>
     <w:p>
@@ -2015,7 +2015,7 @@
           <w:p>
             <w:r/>
             <w:r>
-              <w:t>Capture an order, confirm it, fulfil it from stock, raise the invoice from it</w:t>
+              <w:t>Capture an order, confirm it, fulfil it from stock, raise the invoice from it; attach files (any signed-in role)</w:t>
             </w:r>
           </w:p>
         </w:tc>
@@ -2050,7 +2050,7 @@
           <w:p>
             <w:r/>
             <w:r>
-              <w:t>Issue the tax invoice, record payments against it, download the Fiji-format PDF, void (subject to the rules in section 3.3)</w:t>
+              <w:t>Issue the tax invoice, record payments against it, download the Fiji-format PDF, void (subject to the rules in section 3.3); attach files (any signed-in role)</w:t>
             </w:r>
           </w:p>
         </w:tc>
@@ -2085,7 +2085,7 @@
           <w:p>
             <w:r/>
             <w:r>
-              <w:t>Raise and confirm an order, record goods receipts as deliveries arrive</w:t>
+              <w:t>Raise and confirm an order, record goods receipts as deliveries arrive; attach files (any signed-in role)</w:t>
             </w:r>
           </w:p>
         </w:tc>
@@ -2120,7 +2120,7 @@
           <w:p>
             <w:r/>
             <w:r>
-              <w:t>Enter the supplier's bill against the order, approve it, record payments</w:t>
+              <w:t>Enter the supplier's bill against the order, approve it, record payments; attach files (any signed-in role)</w:t>
             </w:r>
           </w:p>
         </w:tc>
@@ -2604,7 +2604,7 @@
         <w:pStyle w:val="ListBullet"/>
       </w:pPr>
       <w:r>
-        <w:t>File attachments have no screen in the browser client. The upload, list, download and delete API exists and is tested, but nothing in the interface today calls it.</w:t>
+        <w:t>File attachments have a screen on the four document detail pages (sales orders, invoices, purchase orders, supplier invoices) but not on other record types — products, customers and suppliers can be attached to over the API, but nothing in the interface calls it there yet.</w:t>
       </w:r>
     </w:p>
     <w:p>
@@ -3410,7 +3410,7 @@
           <w:p>
             <w:r/>
             <w:r>
-              <w:t>React + TypeScript single-page application, built with Vite; TanStack Query for server state; Tailwind-based design system.</w:t>
+              <w:t>React + TypeScript single-page application, built with Vite; TanStack Query for server state; Tailwind-based design system; route-level code-splitting; Vitest + React Testing Library.</w:t>
             </w:r>
           </w:p>
         </w:tc>
@@ -3767,7 +3767,7 @@
           <w:p>
             <w:r/>
             <w:r>
-              <w:t>Upload, list, download and delete a file against any record, referenced by entity type and id; no browser screen calls it yet</w:t>
+              <w:t>Upload, list, download and delete a file against any record, referenced by entity type and id; the browser client uses it on the four document detail pages</w:t>
             </w:r>
           </w:p>
         </w:tc>
@@ -4247,7 +4247,29 @@
         <w:rPr>
           <w:i w:val="0"/>
         </w:rPr>
-        <w:t>Across the two projects there are 97 test methods (xUnit facts and theories; theories expand to more cases at run time). Run them with `dotnet test` at the repository root. A GitHub Actions workflow runs the full suite, plus a frontend lint and build, on every push and pull request against main.</w:t>
+        <w:t>Across the two projects there are 97 test methods (xUnit facts and theories; theories expand to more cases at run time). Run them with `dotnet test` at the repository root.</w:t>
+      </w:r>
+    </w:p>
+    <w:p>
+      <w:pPr>
+        <w:spacing w:after="160"/>
+      </w:pPr>
+      <w:r>
+        <w:rPr>
+          <w:i w:val="0"/>
+        </w:rPr>
+        <w:t>The browser client carries its own suite: Vitest with React Testing Library, 37 tests across money/date formatting, the API error-message unwrapping, and — the two places a silent regression would matter most — the full authentication state machine (silent re-auth on boot, the login/MFA-challenge/verify sequence against a mocked API, the forced-logout event) and the sign-in form itself driven the way a person would, through react-hook-form and zod validation, not by calling internal functions directly. Run them with `npm run test` in client/.</w:t>
+      </w:r>
+    </w:p>
+    <w:p>
+      <w:pPr>
+        <w:spacing w:after="160"/>
+      </w:pPr>
+      <w:r>
+        <w:rPr>
+          <w:i w:val="0"/>
+        </w:rPr>
+        <w:t>A GitHub Actions workflow runs the backend suite, the frontend suite, a frontend lint pass, and both builds, on every push and pull request against main — so a regression is caught before it merges, not after someone notices it in the running application. That lint pass includes accessibility rules (oxlint's jsx-a11y plugin): every form field's label is associated with its control so a screen reader can announce what it's asking for, interactive elements are reachable by keyboard, and pages avoid disorienting focus jumps.</w:t>
       </w:r>
     </w:p>
     <w:p>
@@ -4545,7 +4567,7 @@
         <w:pStyle w:val="ListBullet"/>
       </w:pPr>
       <w:r>
-        <w:t>Build the browser screens for the attachments API — upload and view files on the relevant detail pages — and add email verification of accounts. Move Hangfire from in-memory storage to a durable store so queued work survives a restart.</w:t>
+        <w:t>Extend the attachments screen to the remaining record types (products, customers, suppliers) beyond the four document detail pages it already covers, and add email verification of accounts. Move Hangfire from in-memory storage to a durable store so queued work survives a restart.</w:t>
       </w:r>
     </w:p>
     <w:p>

</xml_diff>